<commit_message>
posodobitev kaj kdo dela
</commit_message>
<xml_diff>
--- a/datoteke za prijavo/delovna verzija PRIJAVA TEME.docx
+++ b/datoteke za prijavo/delovna verzija PRIJAVA TEME.docx
@@ -4182,20 +4182,20 @@
               <w:textAlignment w:val="baseline"/>
               <w:rPr>
                 <w:rFonts w:ascii="Calibri" w:eastAsia="Times New Roman" w:hAnsi="Calibri" w:cs="Calibri"/>
-                <w:highlight w:val="yellow"/>
+                <w:highlight w:val="red"/>
                 <w:lang w:eastAsia="sl-SI"/>
               </w:rPr>
             </w:pPr>
             <w:r>
               <w:rPr>
-                <w:highlight w:val="yellow"/>
+                <w:highlight w:val="red"/>
               </w:rPr>
               <w:t>Preverjanje ustreznosti pobude z uporabo AI</w:t>
             </w:r>
             <w:r>
               <w:rPr>
                 <w:rFonts w:ascii="Calibri" w:eastAsia="Times New Roman" w:hAnsi="Calibri" w:cs="Calibri"/>
-                <w:highlight w:val="yellow"/>
+                <w:highlight w:val="red"/>
                 <w:lang w:eastAsia="sl-SI"/>
               </w:rPr>
               <w:t xml:space="preserve"> </w:t>
@@ -4835,12 +4835,14 @@
               <w:textAlignment w:val="baseline"/>
               <w:rPr>
                 <w:rFonts w:ascii="Calibri" w:eastAsia="Times New Roman" w:hAnsi="Calibri" w:cs="Calibri"/>
+                <w:highlight w:val="yellow"/>
                 <w:lang w:eastAsia="sl-SI"/>
               </w:rPr>
             </w:pPr>
             <w:r>
               <w:rPr>
                 <w:rFonts w:ascii="Calibri" w:eastAsia="Times New Roman" w:hAnsi="Calibri" w:cs="Calibri"/>
+                <w:highlight w:val="yellow"/>
                 <w:lang w:eastAsia="sl-SI"/>
               </w:rPr>
               <w:t>Priprava produkcijskega okolja</w:t>
@@ -4848,6 +4850,7 @@
             <w:r>
               <w:rPr>
                 <w:rFonts w:ascii="Calibri" w:eastAsia="Times New Roman" w:hAnsi="Calibri" w:cs="Calibri"/>
+                <w:highlight w:val="yellow"/>
                 <w:lang w:eastAsia="sl-SI"/>
               </w:rPr>
               <w:t xml:space="preserve">, </w:t>
@@ -4856,6 +4859,7 @@
             <w:r>
               <w:rPr>
                 <w:rFonts w:ascii="Calibri" w:eastAsia="Times New Roman" w:hAnsi="Calibri" w:cs="Calibri"/>
+                <w:highlight w:val="yellow"/>
                 <w:lang w:eastAsia="sl-SI"/>
               </w:rPr>
               <w:t>dokerizacija</w:t>
@@ -4864,6 +4868,7 @@
             <w:r>
               <w:rPr>
                 <w:rFonts w:ascii="Calibri" w:eastAsia="Times New Roman" w:hAnsi="Calibri" w:cs="Calibri"/>
+                <w:highlight w:val="yellow"/>
                 <w:lang w:eastAsia="sl-SI"/>
               </w:rPr>
               <w:t xml:space="preserve"> in </w:t>
@@ -4872,6 +4877,7 @@
             <w:r>
               <w:rPr>
                 <w:rFonts w:ascii="Calibri" w:eastAsia="Times New Roman" w:hAnsi="Calibri" w:cs="Calibri"/>
+                <w:highlight w:val="yellow"/>
                 <w:lang w:eastAsia="sl-SI"/>
               </w:rPr>
               <w:t>deployment</w:t>

</xml_diff>